<commit_message>
added modern network rp
</commit_message>
<xml_diff>
--- a/SEM2/Modern Networking/ahmed-bigdatacloud.docx
+++ b/SEM2/Modern Networking/ahmed-bigdatacloud.docx
@@ -18,7 +18,7 @@
           <w:sz w:val="44"/>
           <w:szCs w:val="44"/>
         </w:rPr>
-        <w:t xml:space="preserve">Big </w:t>
+        <w:t xml:space="preserve">BIG </w:t>
       </w:r>
       <w:r>
         <w:rPr>
@@ -27,16 +27,7 @@
           <w:sz w:val="44"/>
           <w:szCs w:val="44"/>
         </w:rPr>
-        <w:t>Data and Cloud Computing in Networking</w:t>
-      </w:r>
-      <w:r>
-        <w:rPr>
-          <w:rFonts w:ascii="Times New Roman" w:hAnsi="Times New Roman" w:cs="Times New Roman"/>
-          <w:b/>
-          <w:sz w:val="44"/>
-          <w:szCs w:val="44"/>
-        </w:rPr>
-        <w:t xml:space="preserve"> </w:t>
+        <w:t xml:space="preserve">DATA AND CLOUD COMPUTING IN NETWORKING </w:t>
       </w:r>
     </w:p>
     <w:p>
@@ -570,6 +561,7 @@
           </w:tcPr>
           <w:p>
             <w:pPr>
+              <w:jc w:val="center"/>
               <w:rPr>
                 <w:rFonts w:ascii="Times New Roman" w:eastAsia="SimSun" w:hAnsi="Times New Roman" w:cs="Times New Roman"/>
                 <w:b/>
@@ -596,6 +588,7 @@
           </w:tcPr>
           <w:p>
             <w:pPr>
+              <w:jc w:val="center"/>
               <w:rPr>
                 <w:rFonts w:ascii="Times New Roman" w:eastAsia="SimSun" w:hAnsi="Times New Roman" w:cs="Times New Roman"/>
                 <w:b/>
@@ -622,6 +615,7 @@
           </w:tcPr>
           <w:p>
             <w:pPr>
+              <w:jc w:val="center"/>
               <w:rPr>
                 <w:rFonts w:ascii="Times New Roman" w:eastAsia="SimSun" w:hAnsi="Times New Roman" w:cs="Times New Roman"/>
                 <w:b/>
@@ -12009,6 +12003,7 @@
   <w:style w:type="character" w:default="1" w:styleId="DefaultParagraphFont">
     <w:name w:val="Default Paragraph Font"/>
     <w:uiPriority w:val="1"/>
+    <w:semiHidden/>
     <w:unhideWhenUsed/>
   </w:style>
   <w:style w:type="table" w:default="1" w:styleId="TableNormal">
@@ -22597,6 +22592,10 @@
 </file>
 
 <file path=customXml/item1.xml><?xml version="1.0" encoding="utf-8"?>
+<b:Sources xmlns:b="http://schemas.openxmlformats.org/officeDocument/2006/bibliography" xmlns="http://schemas.openxmlformats.org/officeDocument/2006/bibliography" SelectedStyle="/APA.XSL" StyleName="APA"/>
+</file>
+
+<file path=customXml/item2.xml><?xml version="1.0" encoding="utf-8"?>
 <s:customData xmlns="http://www.wps.cn/officeDocument/2013/wpsCustomData" xmlns:s="http://www.wps.cn/officeDocument/2013/wpsCustomData">
   <customSectProps>
     <customSectPr/>
@@ -22611,22 +22610,18 @@
 </s:customData>
 </file>
 
-<file path=customXml/item2.xml><?xml version="1.0" encoding="utf-8"?>
-<b:Sources xmlns:b="http://schemas.openxmlformats.org/officeDocument/2006/bibliography" xmlns="http://schemas.openxmlformats.org/officeDocument/2006/bibliography" SelectedStyle="/APA.XSL" StyleName="APA"/>
+<file path=customXml/itemProps1.xml><?xml version="1.0" encoding="utf-8"?>
+<ds:datastoreItem xmlns:ds="http://schemas.openxmlformats.org/officeDocument/2006/customXml" ds:itemID="{EF278816-EC6F-A645-907D-7F25AECB1D4A}">
+  <ds:schemaRefs>
+    <ds:schemaRef ds:uri="http://schemas.openxmlformats.org/officeDocument/2006/bibliography"/>
+  </ds:schemaRefs>
+</ds:datastoreItem>
 </file>
 
-<file path=customXml/itemProps1.xml><?xml version="1.0" encoding="utf-8"?>
+<file path=customXml/itemProps2.xml><?xml version="1.0" encoding="utf-8"?>
 <ds:datastoreItem xmlns:ds="http://schemas.openxmlformats.org/officeDocument/2006/customXml" ds:itemID="{B1977F7D-205B-4081-913C-38D41E755F92}">
   <ds:schemaRefs>
     <ds:schemaRef ds:uri="http://www.wps.cn/officeDocument/2013/wpsCustomData"/>
   </ds:schemaRefs>
 </ds:datastoreItem>
-</file>
-
-<file path=customXml/itemProps2.xml><?xml version="1.0" encoding="utf-8"?>
-<ds:datastoreItem xmlns:ds="http://schemas.openxmlformats.org/officeDocument/2006/customXml" ds:itemID="{EF278816-EC6F-A645-907D-7F25AECB1D4A}">
-  <ds:schemaRefs>
-    <ds:schemaRef ds:uri="http://schemas.openxmlformats.org/officeDocument/2006/bibliography"/>
-  </ds:schemaRefs>
-</ds:datastoreItem>
 </file>
</xml_diff>